<commit_message>
Add captured source registry figure and matching attribution
</commit_message>
<xml_diff>
--- a/Intelligence_Assessment_First_Term_Synthetic_Party_v01.docx
+++ b/Intelligence_Assessment_First_Term_Synthetic_Party_v01.docx
@@ -140,6 +140,80 @@
           <w:color w:val="000000"/>
         </w:rPr>
         <w:t xml:space="preserve">Drawing on organisational resources from the Danish IT sector, I registered the party name, developed the dataset, managed finances, and facilitated international collaboration. The archive I assembled through this work documents the practice and enables independent scrutiny of the party’s production. By publishing a screened source edition of this private production archive of 3,056 catalogued records, I integrate the training data, code, contracts, invoices, email correspondence, and Discord exchanges that shaped the party into the same publicly accessible record as its public claims, legal registrations, and interactions with citizens (Staunæs 2026a). The intersection of art, technology, and democracy nevertheless limits how far findings can be generalised to conventional parties.</w:t>
+      </w:r>
+    </w:p>
+    <w:p>
+      <w:pPr>
+        <w:keepNext/>
+        <w:spacing w:before="160" w:after="80"/>
+        <w:jc w:val="center"/>
+      </w:pPr>
+      <w:r>
+        <w:drawing>
+          <wp:inline xmlns:a="http://schemas.openxmlformats.org/drawingml/2006/main" xmlns:pic="http://schemas.openxmlformats.org/drawingml/2006/picture">
+            <wp:extent cx="5623560" cy="3861814"/>
+            <wp:docPr id="1" name="Picture 1" descr="Public source registry terminal, showing dossier navigation and the procedure for contesting records"/>
+            <wp:cNvGraphicFramePr>
+              <a:graphicFrameLocks noChangeAspect="1"/>
+            </wp:cNvGraphicFramePr>
+            <a:graphic>
+              <a:graphicData uri="http://schemas.openxmlformats.org/drawingml/2006/picture">
+                <pic:pic>
+                  <pic:nvPicPr>
+                    <pic:cNvPr id="0" name="intelligence-assessment-pages-front.png"/>
+                    <pic:cNvPicPr/>
+                  </pic:nvPicPr>
+                  <pic:blipFill>
+                    <a:blip r:embed="rId11"/>
+                    <a:stretch>
+                      <a:fillRect/>
+                    </a:stretch>
+                  </pic:blipFill>
+                  <pic:spPr>
+                    <a:xfrm>
+                      <a:off x="0" y="0"/>
+                      <a:ext cx="5623560" cy="3861814"/>
+                    </a:xfrm>
+                    <a:prstGeom prst="rect"/>
+                  </pic:spPr>
+                </pic:pic>
+              </a:graphicData>
+            </a:graphic>
+          </wp:inline>
+        </w:drawing>
+      </w:r>
+    </w:p>
+    <w:p>
+      <w:pPr>
+        <w:keepLines/>
+        <w:spacing w:before="40" w:after="160"/>
+        <w:jc w:val="left"/>
+      </w:pPr>
+      <w:r>
+        <w:rPr>
+          <w:rFonts w:ascii="Times New Roman" w:hAnsi="Times New Roman"/>
+          <w:b/>
+          <w:color w:val="000000"/>
+          <w:sz w:val="18"/>
+        </w:rPr>
+        <w:t xml:space="preserve">Figure 1. </w:t>
+      </w:r>
+      <w:r>
+        <w:rPr>
+          <w:rFonts w:ascii="Times New Roman" w:hAnsi="Times New Roman"/>
+          <w:i/>
+          <w:color w:val="000000"/>
+          <w:sz w:val="18"/>
+        </w:rPr>
+        <w:t>Intelligence Assessment: First Term of The Synthetic Party</w:t>
+      </w:r>
+      <w:r>
+        <w:rPr>
+          <w:rFonts w:ascii="Times New Roman" w:hAnsi="Times New Roman"/>
+          <w:color w:val="000000"/>
+          <w:sz w:val="18"/>
+        </w:rPr>
+        <w:t>, Public source registry, v.01. Computer Lars / Asker Bryld Staunæs, 2026. Screenshot of the deployed site, 30 October 2026.</w:t>
       </w:r>
     </w:p>
     <w:p>

</xml_diff>

<commit_message>
Add international case-selection hinge to Commissioner tasking
</commit_message>
<xml_diff>
--- a/Intelligence_Assessment_First_Term_Synthetic_Party_v01.docx
+++ b/Intelligence_Assessment_First_Term_Synthetic_Party_v01.docx
@@ -424,7 +424,7 @@
           <w:rFonts w:ascii="Times New Roman" w:hAnsi="Times New Roman" w:eastAsia="Times New Roman" w:cs="Times New Roman"/>
           <w:color w:val="000000"/>
         </w:rPr>
-        <w:t xml:space="preserve">The Shield seeks to assess how AI-driven political parties affect citizen engagement, election integrity, and EU democratic institutions. In </w:t>
+        <w:t xml:space="preserve">The Shield seeks to assess how AI-driven political parties affect citizen engagement, election integrity, and EU democratic institutions. The Synthetic Party of Denmark, whose contacts with AI-driven political actors extend beyond Europe, has been selected for review. In the MIT Technology Review, it was presented</w:t>
       </w:r>
       <w:r>
         <w:rPr>
@@ -432,14 +432,14 @@
           <w:color w:val="000000"/>
           <w:i w:val="1"/>
         </w:rPr>
-        <w:t>MIT Technology Review</w:t>
-      </w:r>
-      <w:r>
-        <w:rPr>
-          <w:rFonts w:ascii="Times New Roman" w:hAnsi="Times New Roman" w:eastAsia="Times New Roman" w:cs="Times New Roman"/>
-          <w:color w:val="000000"/>
-        </w:rPr>
-        <w:t xml:space="preserve">, The Synthetic Party was presented as a step towards </w:t>
+        <w:t/>
+      </w:r>
+      <w:r>
+        <w:rPr>
+          <w:rFonts w:ascii="Times New Roman" w:hAnsi="Times New Roman" w:eastAsia="Times New Roman" w:cs="Times New Roman"/>
+          <w:color w:val="000000"/>
+        </w:rPr>
+        <w:t xml:space="preserve"> as a step towards </w:t>
       </w:r>
       <w:r>
         <w:rPr>
@@ -525,7 +525,7 @@
           <w:color w:val="000000"/>
         </w:rPr>
         <w:lastRenderedPageBreak/>
-        <w:t xml:space="preserve">Establish the capabilities and intentions of The Synthetic Party and its international contacts from the intercepts (correspondence, code, and published material), tracing their financial, technical, and organisational enablers (EEAS 2026, 7). Build source-linked dossiers from these materials and record any relevant public lectures and discussions. Do not treat past activities as breaches of requirements not yet in force.</w:t>
+        <w:t xml:space="preserve">Establish the capabilities and intentions of The Synthetic Party and its international contacts, particularly those beyond Europe, from the intercepts (correspondence, code, and published material), tracing their financial, technical, and organisational enablers (EEAS 2026, 7). Build source-linked dossiers from these materials and record any relevant public lectures and discussions. Do not treat past activities as breaches of requirements not yet in force.</w:t>
       </w:r>
     </w:p>
     <w:p>

</xml_diff>

<commit_message>
Distinguish fictional agent exchanges from local AI archival research
</commit_message>
<xml_diff>
--- a/Intelligence_Assessment_First_Term_Synthetic_Party_v01.docx
+++ b/Intelligence_Assessment_First_Term_Synthetic_Party_v01.docx
@@ -332,7 +332,7 @@
           <w:color w:val="000000"/>
         </w:rPr>
         <w:lastRenderedPageBreak/>
-        <w:t xml:space="preserve">The inquiry is structured around four specialist AI agents—Participation and Representation, Information Integrity, Institutional Capacity, and Transnational Activity—adapting the EEAS’s approach to evidence collection and knowledge sharing (EEAS 2023, 28–29). The four agents are compartmentalised from one another’s internal reasoning. Each agent screens the intercepted material and assembles dossiers within its mandate, receiving other agents’ findings and questions only through the coordinating, likewise agentic, environment. The agent-to-agent exchanges are fictitious, not records of an AI simulation. </w:t>
+        <w:t xml:space="preserve">The inquiry is structured around four specialist AI agents—Participation and Representation, Information Integrity, Institutional Capacity, and Transnational Activity—adapting the EEAS’s approach to evidence collection and knowledge sharing (EEAS 2023, 28–29). The four agents are compartmentalised from one another’s internal reasoning. Each agent screens the intercepted material and assembles dossiers within its mandate, receiving other agents’ findings and questions only through the coordinating, likewise agentic, environment. The agent-to-agent exchanges are fictitious, not records of an AI simulation, although I myself employed local AI agents to retrieve, organise and navigate the material. </w:t>
       </w:r>
       <w:r>
         <w:rPr>
@@ -346,7 +346,7 @@
           <w:rFonts w:ascii="Times New Roman" w:hAnsi="Times New Roman" w:eastAsia="Times New Roman" w:cs="Times New Roman"/>
           <w:color w:val="000000"/>
         </w:rPr>
-        <w:t xml:space="preserve"> Within the fiction, the agents assemble them into dossiers.</w:t>
+        <w:t xml:space="preserve"> Within the fiction, the agents intercept my stored records to build the case.</w:t>
       </w:r>
     </w:p>
     <w:p>

</xml_diff>

<commit_message>
Refine speculative method and trim citations in article
</commit_message>
<xml_diff>
--- a/Intelligence_Assessment_First_Term_Synthetic_Party_v01.docx
+++ b/Intelligence_Assessment_First_Term_Synthetic_Party_v01.docx
@@ -252,14 +252,14 @@
           <w:rFonts w:ascii="Times New Roman" w:hAnsi="Times New Roman" w:eastAsia="Times New Roman" w:cs="Times New Roman"/>
           <w:color w:val="000000"/>
         </w:rPr>
-        <w:t xml:space="preserve">With AI-powered parties, I define a problem-space of ‘synthetic politics’ in which generative AI agents function as political actors, creating positions, discourses, and decisions in real time rather than merely supporting or mediating human actions (Malý and Staunæs 2026; Staunæs 2026c). In The Synthetic Party, AI is not just a tool but acts as a leader or representative, generating statements </w:t>
-      </w:r>
-      <w:r>
-        <w:rPr>
-          <w:rFonts w:ascii="Times New Roman" w:hAnsi="Times New Roman" w:eastAsia="Times New Roman" w:cs="Times New Roman"/>
-          <w:color w:val="000000"/>
-        </w:rPr>
-        <w:t xml:space="preserve">that may become party policy. In contrast, digital parties use internet platforms and tools to organise and connect human members, with humans retaining final decision-making authority (Gerbaudo 2019). Platform parties, a variant of digital parties described as “highly centralized, led by a charismatic leader” (Deseriis 2020, 896), delegate many internal processes, such as voting and participation, to digital systems, </w:t>
+        <w:t xml:space="preserve">With AI-powered parties, I define a problem-space of ‘synthetic politics’ in which generative AI agents function as political actors, creating positions, discourses, and decisions in real time rather than merely supporting or mediating human actions (Malý and Staunæs 2026; Staunæs 2026c). As The Synthetic Party’s public representative, Leader Lars generates statements that may become party policy. Digital parties, by contrast, use internet platforms and tools</w:t>
+      </w:r>
+      <w:r>
+        <w:rPr>
+          <w:rFonts w:ascii="Times New Roman" w:hAnsi="Times New Roman" w:eastAsia="Times New Roman" w:cs="Times New Roman"/>
+          <w:color w:val="000000"/>
+        </w:rPr>
+        <w:t xml:space="preserve"> to organise and connect human members, with humans retaining final decision-making authority (Gerbaudo 2019). Platform parties, a variant of digital parties described as “highly centralized, led by a charismatic leader” (Deseriis 2020, 896), delegate many internal processes, such as voting and participation, to digital systems, </w:t>
       </w:r>
       <w:r>
         <w:rPr>
@@ -273,14 +273,14 @@
           <w:rFonts w:ascii="Times New Roman" w:hAnsi="Times New Roman" w:eastAsia="Times New Roman" w:cs="Times New Roman"/>
           <w:color w:val="000000"/>
         </w:rPr>
-        <w:t xml:space="preserve"> Prior to the publication of the first comparative study of ten synthetic political actors by Michal Malý, Giulia Sandri, and Oscar Barberà, I had already engaged with seven of these actors at the Synthetic Summit I organised in Aarhus, which informed the identification of those seven cases in the study (Malý et al. 2026; </w:t>
-      </w:r>
-      <w:r>
-        <w:rPr>
-          <w:rFonts w:ascii="Times New Roman" w:hAnsi="Times New Roman" w:eastAsia="Times New Roman" w:cs="Times New Roman"/>
-          <w:color w:val="000000"/>
-        </w:rPr>
-        <w:t>A27).</w:t>
+        <w:t xml:space="preserve"/>
+      </w:r>
+      <w:r>
+        <w:rPr>
+          <w:rFonts w:ascii="Times New Roman" w:hAnsi="Times New Roman" w:eastAsia="Times New Roman" w:cs="Times New Roman"/>
+          <w:color w:val="000000"/>
+        </w:rPr>
+        <w:t/>
       </w:r>
     </w:p>
     <w:p>
@@ -292,7 +292,7 @@
           <w:rFonts w:ascii="Times New Roman" w:hAnsi="Times New Roman" w:eastAsia="Times New Roman" w:cs="Times New Roman"/>
           <w:color w:val="000000"/>
         </w:rPr>
-        <w:t>In investigating the party’s archive, I analyse The Synthetic Party’s specificity as an immanent critique of party form. I present this critique as an AI-driven intelligence assessment of The Synthetic Party by the European Democracy Sword, a fictional EEAS bureau supporting the European Democracy Shield. The EEAS proposes to “act as the operational ‘sword’” in “complementarity with the Democracy Shield” (EEAS 2026, 7). I envision the state's focus on cultural meaning taking a strange Cold War-style turn</w:t>
+        <w:t>In investigating the party’s archive, I stage a speculative bureaucracy in the present (cf. Austin and Leander 2025, whose European policy fiction is set in 2050) to examine how The Synthetic Party’s own operations fabulate an immanent critique of democratic innovation. I present this critique as an AI-driven intelligence assessment of The Synthetic Party by the European Democracy Sword, a fictional EEAS bureau supporting the European Democracy Shield. The real EEAS recently proposed to “act as the operational ‘sword’” in “complementarity with the Democracy Shield” (EEAS 2026, 7). I envision the state's focus on cultural meaning taking a strange Cold War-style turn</w:t>
       </w:r>
       <w:r>
         <w:rPr>
@@ -332,7 +332,7 @@
           <w:color w:val="000000"/>
         </w:rPr>
         <w:lastRenderedPageBreak/>
-        <w:t xml:space="preserve">The inquiry is structured around four specialist AI agents—Participation and Representation, Information Integrity, Institutional Capacity, and Transnational Activity—adapting the EEAS’s approach to evidence collection and knowledge sharing (EEAS 2023, 28–29). The four agents are compartmentalised from one another’s internal reasoning. Each agent screens the intercepted material and assembles dossiers within its mandate, receiving other agents’ findings and questions only through the coordinating, likewise agentic, environment. The agent-to-agent exchanges are fictitious, not records of an AI simulation, although I myself employed local AI agents to retrieve, organise and navigate the material. </w:t>
+        <w:t xml:space="preserve">The inquiry is structured around four specialist AI agents—Participation and Representation, Information Integrity, Institutional Capacity, and Transnational Activity—adapting the EEAS’s approach to evidence collection and knowledge sharing (EEAS 2023, 28–29). The four agents are compartmentalised from one another’s internal reasoning. Each agent screens the intercepted material and assembles dossiers within its mandate, receiving other agents’ findings and questions only through the coordinating, likewise agentic, environment. The agent-to-agent exchanges are fictitious, not records of an autonomous AI simulation, although I myself employed local AI agents to retrieve, organise and navigate the material (cf. Berg and Pink 2026 on AI participation in speculative ethnography). </w:t>
       </w:r>
       <w:r>
         <w:rPr>
@@ -474,7 +474,7 @@
           <w:rFonts w:ascii="Times New Roman" w:hAnsi="Times New Roman" w:eastAsia="Times New Roman" w:cs="Times New Roman"/>
           <w:color w:val="000000"/>
         </w:rPr>
-        <w:t xml:space="preserve">Taking The Synthetic Party as an early example, subsequent research models the AI party as a full operating system in which delegated agents conduct opposition research, analyse strategy, and fact-check claims while voters retain final authority (Go and Kim 2025; Go 2025, §III.2). While the Commission's explanatory material already identifies public-facing political chatbots that campaign for a candidate or policy as a potentially high-risk electoral use (AI Act Service Desk n.d.), the proposed operating system would extend AI from a conversational figurehead into the operational infrastructure of party competition.</w:t>
+        <w:t xml:space="preserve">Taking The Synthetic Party as an early example, subsequent research models the AI party as a full operating system in which delegated agents conduct opposition research, analyse strategy, and fact-check claims while voters retain final authority (Go and Kim 2025). While the Commission's explanatory material already identifies public-facing political chatbots that campaign for a candidate or policy as a potentially high-risk electoral use (AI Act Service Desk n.d.), the proposed operating system would extend AI from a conversational figurehead into the operational infrastructure of party competition.</w:t>
       </w:r>
     </w:p>
     <w:p>
@@ -761,7 +761,7 @@
           <w:rFonts w:ascii="Times New Roman" w:hAnsi="Times New Roman" w:eastAsia="Times New Roman" w:cs="Times New Roman"/>
           <w:color w:val="000000"/>
         </w:rPr>
-        <w:t>Silvija Vuković then tracked Leader Lars across three successive analyses of chatbot politicians. In her first piece (Vuković 2022), published in December 2022, shortly after her own interview with Leader Lars on Discord, she examined how the AI politician presents itself as calm, rational, and always available to the people, and termed this a potential "next level" of populism. In her second ECPR piece (Vuković 2024), she argued that the chatbot politician creates the sense of a private, one-to-one chat and of completely neutral AI calculation, thus placing the people against corrupt human politicians, with human programmers effectively behind the scenes. In her third article (Vuković 2025), she warns that this technopopulist appeal could very easily slip into illiberalism if the electorate comes to prefer an unaccountable AI to the democratic process of disagreement.</w:t>
+        <w:t>Silvija Vuković followed Leader Lars across three analyses of chatbot politicians. After interviewing him on Discord, she described the AI politician’s calm, rational availability to the people as a potential "next level" of populism (Vuković 2022). In her second ECPR piece, she argued that chatbot politicians create the sense of a private, one-to-one chat and of completely neutral AI calculation, placing the people against corrupt human politicians while human programmers remain behind the scenes (Vuković 2024). In her third, she warned that this technopopulist appeal could slip into illiberalism if the electorate came to prefer an unaccountable AI to the democratic process of disagreement (Vuković 2025).</w:t>
       </w:r>
     </w:p>
     <w:p>
@@ -1942,23 +1942,22 @@
           <w:rFonts w:ascii="Times New Roman" w:hAnsi="Times New Roman" w:eastAsia="Times New Roman" w:cs="Times New Roman"/>
           <w:color w:val="000000"/>
         </w:rPr>
-        <w:t xml:space="preserve">Bendyk, Edwin. 2022. “Kulturalni i wulgarni – wirtualni przywódcy sondują mechanizmy demokracji.” </w:t>
-      </w:r>
-      <w:r>
-        <w:rPr>
-          <w:rFonts w:ascii="Times New Roman" w:hAnsi="Times New Roman" w:eastAsia="Times New Roman" w:cs="Times New Roman"/>
-          <w:i/>
-          <w:iCs/>
-          <w:color w:val="000000"/>
-        </w:rPr>
-        <w:t xml:space="preserve">Pulsar</w:t>
-      </w:r>
-      <w:r>
-        <w:rPr>
-          <w:rFonts w:ascii="Times New Roman" w:hAnsi="Times New Roman" w:eastAsia="Times New Roman" w:cs="Times New Roman"/>
-          <w:color w:val="000000"/>
-        </w:rPr>
-        <w:t xml:space="preserve">, 17 October. https://www.projektpulsar.pl/struktura/2185926,1,kulturalni-i-wulgarni--wirtualni-przywodcy-sonduja-mechanizmy-demokracji.read.</w:t>
+        <w:t xml:space="preserve">Austin, Jonathan Luke and Anna Leander. 2025. “The Future of Academic Expertise: Speculative European Bureaucratic Fabulations.” In </w:t>
+      </w:r>
+      <w:r>
+        <w:rPr>
+          <w:rFonts w:ascii="Times New Roman" w:hAnsi="Times New Roman" w:eastAsia="Times New Roman" w:cs="Times New Roman"/>
+          <w:color w:val="000000"/>
+          <w:i w:val="1"/>
+        </w:rPr>
+        <w:t>Knowledge and Expertise in International Politics: A Handbook</w:t>
+      </w:r>
+      <w:r>
+        <w:rPr>
+          <w:rFonts w:ascii="Times New Roman" w:hAnsi="Times New Roman" w:eastAsia="Times New Roman" w:cs="Times New Roman"/>
+          <w:color w:val="000000"/>
+        </w:rPr>
+        <w:t>, ed. Berit Bliesemann de Guevara et al., 954–967. Oxford: Oxford University Press. https://doi.org/10.1093/oso/9780192871145.003.0062.</w:t>
       </w:r>
     </w:p>
     <w:p>
@@ -1972,7 +1971,7 @@
           <w:rFonts w:ascii="Times New Roman" w:hAnsi="Times New Roman" w:eastAsia="Times New Roman" w:cs="Times New Roman"/>
           <w:color w:val="000000"/>
         </w:rPr>
-        <w:t xml:space="preserve">Bickerton, Christopher J. and Carlo Invernizzi Accetti. 2021. </w:t>
+        <w:t xml:space="preserve">Bendyk, Edwin. 2022. “Kulturalni i wulgarni – wirtualni przywódcy sondują mechanizmy demokracji.” </w:t>
       </w:r>
       <w:r>
         <w:rPr>
@@ -1981,14 +1980,14 @@
           <w:iCs/>
           <w:color w:val="000000"/>
         </w:rPr>
-        <w:t xml:space="preserve">Technopopulism: The New Logic of Democratic Politics</w:t>
-      </w:r>
-      <w:r>
-        <w:rPr>
-          <w:rFonts w:ascii="Times New Roman" w:hAnsi="Times New Roman" w:eastAsia="Times New Roman" w:cs="Times New Roman"/>
-          <w:color w:val="000000"/>
-        </w:rPr>
-        <w:t xml:space="preserve">. Oxford: Oxford University Press. https://doi.org/10.1093/oso/9780198807766.001.0001.</w:t>
+        <w:t xml:space="preserve">Pulsar</w:t>
+      </w:r>
+      <w:r>
+        <w:rPr>
+          <w:rFonts w:ascii="Times New Roman" w:hAnsi="Times New Roman" w:eastAsia="Times New Roman" w:cs="Times New Roman"/>
+          <w:color w:val="000000"/>
+        </w:rPr>
+        <w:t xml:space="preserve">, 17 October. https://www.projektpulsar.pl/struktura/2185926,1,kulturalni-i-wulgarni--wirtualni-przywodcy-sonduja-mechanizmy-demokracji.read.</w:t>
       </w:r>
     </w:p>
     <w:p>
@@ -2002,23 +2001,22 @@
           <w:rFonts w:ascii="Times New Roman" w:hAnsi="Times New Roman" w:eastAsia="Times New Roman" w:cs="Times New Roman"/>
           <w:color w:val="000000"/>
         </w:rPr>
-        <w:t xml:space="preserve">D’Amato, Alessandro. 2026. “L’uscita di Grillo contro il M5s e il partito di Alessandro Di Battista per le elezioni.” </w:t>
-      </w:r>
-      <w:r>
-        <w:rPr>
-          <w:rFonts w:ascii="Times New Roman" w:hAnsi="Times New Roman" w:eastAsia="Times New Roman" w:cs="Times New Roman"/>
-          <w:i/>
-          <w:iCs/>
-          <w:color w:val="000000"/>
-        </w:rPr>
-        <w:t xml:space="preserve">Open</w:t>
-      </w:r>
-      <w:r>
-        <w:rPr>
-          <w:rFonts w:ascii="Times New Roman" w:hAnsi="Times New Roman" w:eastAsia="Times New Roman" w:cs="Times New Roman"/>
-          <w:color w:val="000000"/>
-        </w:rPr>
-        <w:t xml:space="preserve">, 30 July. https://www.open.online/2026/07/30/alessandro-di-battista-elezioni-grillo-m5s/.</w:t>
+        <w:t xml:space="preserve">Berg, Martin and Sarah Pink. 2026. “Speculating with Machines: Generative AI in Futures Ethnography.” </w:t>
+      </w:r>
+      <w:r>
+        <w:rPr>
+          <w:rFonts w:ascii="Times New Roman" w:hAnsi="Times New Roman" w:eastAsia="Times New Roman" w:cs="Times New Roman"/>
+          <w:color w:val="000000"/>
+          <w:i w:val="1"/>
+        </w:rPr>
+        <w:t>Qualitative Inquiry</w:t>
+      </w:r>
+      <w:r>
+        <w:rPr>
+          <w:rFonts w:ascii="Times New Roman" w:hAnsi="Times New Roman" w:eastAsia="Times New Roman" w:cs="Times New Roman"/>
+          <w:color w:val="000000"/>
+        </w:rPr>
+        <w:t>, advance online publication, 29 March. https://doi.org/10.1177/10778004261434468.</w:t>
       </w:r>
     </w:p>
     <w:p>
@@ -2032,7 +2030,7 @@
           <w:rFonts w:ascii="Times New Roman" w:hAnsi="Times New Roman" w:eastAsia="Times New Roman" w:cs="Times New Roman"/>
           <w:color w:val="000000"/>
         </w:rPr>
-        <w:t xml:space="preserve">Deseriis, Marco. 2020. “Two Variants of the Digital Party: The Platform Party and the Networked Party.” </w:t>
+        <w:t xml:space="preserve">Bickerton, Christopher J. and Carlo Invernizzi Accetti. 2021. </w:t>
       </w:r>
       <w:r>
         <w:rPr>
@@ -2041,14 +2039,14 @@
           <w:iCs/>
           <w:color w:val="000000"/>
         </w:rPr>
-        <w:t xml:space="preserve">Partecipazione e Conflitto</w:t>
-      </w:r>
-      <w:r>
-        <w:rPr>
-          <w:rFonts w:ascii="Times New Roman" w:hAnsi="Times New Roman" w:eastAsia="Times New Roman" w:cs="Times New Roman"/>
-          <w:color w:val="000000"/>
-        </w:rPr>
-        <w:t xml:space="preserve"> 13 (1): 896–917. https://doi.org/10.1285/i20356609v13i1p896.</w:t>
+        <w:t xml:space="preserve">Technopopulism: The New Logic of Democratic Politics</w:t>
+      </w:r>
+      <w:r>
+        <w:rPr>
+          <w:rFonts w:ascii="Times New Roman" w:hAnsi="Times New Roman" w:eastAsia="Times New Roman" w:cs="Times New Roman"/>
+          <w:color w:val="000000"/>
+        </w:rPr>
+        <w:t xml:space="preserve">. Oxford: Oxford University Press. https://doi.org/10.1093/oso/9780198807766.001.0001.</w:t>
       </w:r>
     </w:p>
     <w:p>
@@ -2062,7 +2060,7 @@
           <w:rFonts w:ascii="Times New Roman" w:hAnsi="Times New Roman" w:eastAsia="Times New Roman" w:cs="Times New Roman"/>
           <w:color w:val="000000"/>
         </w:rPr>
-        <w:t xml:space="preserve">Dommett, Katharine and Sam Power. 2021. “Studying Digital Parties: Methods, Challenges and Responses.” In </w:t>
+        <w:t xml:space="preserve">D’Amato, Alessandro. 2026. “L’uscita di Grillo contro il M5s e il partito di Alessandro Di Battista per le elezioni.” </w:t>
       </w:r>
       <w:r>
         <w:rPr>
@@ -2071,14 +2069,14 @@
           <w:iCs/>
           <w:color w:val="000000"/>
         </w:rPr>
-        <w:t xml:space="preserve">Digital Parties: The Challenges of Online Organisation and Participation</w:t>
-      </w:r>
-      <w:r>
-        <w:rPr>
-          <w:rFonts w:ascii="Times New Roman" w:hAnsi="Times New Roman" w:eastAsia="Times New Roman" w:cs="Times New Roman"/>
-          <w:color w:val="000000"/>
-        </w:rPr>
-        <w:t xml:space="preserve">, ed. Oscar Barberà, Giulia Sandri, Patricia Correa and Juan Rodríguez-Teruel, 67–83. Cham: Springer. https://doi.org/10.1007/978-3-030-78668-7_4.</w:t>
+        <w:t xml:space="preserve">Open</w:t>
+      </w:r>
+      <w:r>
+        <w:rPr>
+          <w:rFonts w:ascii="Times New Roman" w:hAnsi="Times New Roman" w:eastAsia="Times New Roman" w:cs="Times New Roman"/>
+          <w:color w:val="000000"/>
+        </w:rPr>
+        <w:t xml:space="preserve">, 30 July. https://www.open.online/2026/07/30/alessandro-di-battista-elezioni-grillo-m5s/.</w:t>
       </w:r>
     </w:p>
     <w:p>
@@ -2092,6 +2090,66 @@
           <w:rFonts w:ascii="Times New Roman" w:hAnsi="Times New Roman" w:eastAsia="Times New Roman" w:cs="Times New Roman"/>
           <w:color w:val="000000"/>
         </w:rPr>
+        <w:t xml:space="preserve">Deseriis, Marco. 2020. “Two Variants of the Digital Party: The Platform Party and the Networked Party.” </w:t>
+      </w:r>
+      <w:r>
+        <w:rPr>
+          <w:rFonts w:ascii="Times New Roman" w:hAnsi="Times New Roman" w:eastAsia="Times New Roman" w:cs="Times New Roman"/>
+          <w:i/>
+          <w:iCs/>
+          <w:color w:val="000000"/>
+        </w:rPr>
+        <w:t xml:space="preserve">Partecipazione e Conflitto</w:t>
+      </w:r>
+      <w:r>
+        <w:rPr>
+          <w:rFonts w:ascii="Times New Roman" w:hAnsi="Times New Roman" w:eastAsia="Times New Roman" w:cs="Times New Roman"/>
+          <w:color w:val="000000"/>
+        </w:rPr>
+        <w:t xml:space="preserve"> 13 (1): 896–917. https://doi.org/10.1285/i20356609v13i1p896.</w:t>
+      </w:r>
+    </w:p>
+    <w:p>
+      <w:pPr>
+        <w:spacing w:line="360" w:lineRule="auto"/>
+        <w:ind w:left="317" w:hanging="317"/>
+        <w:keepLines w:val="1"/>
+      </w:pPr>
+      <w:r>
+        <w:rPr>
+          <w:rFonts w:ascii="Times New Roman" w:hAnsi="Times New Roman" w:eastAsia="Times New Roman" w:cs="Times New Roman"/>
+          <w:color w:val="000000"/>
+        </w:rPr>
+        <w:t xml:space="preserve">Dommett, Katharine and Sam Power. 2021. “Studying Digital Parties: Methods, Challenges and Responses.” In </w:t>
+      </w:r>
+      <w:r>
+        <w:rPr>
+          <w:rFonts w:ascii="Times New Roman" w:hAnsi="Times New Roman" w:eastAsia="Times New Roman" w:cs="Times New Roman"/>
+          <w:i/>
+          <w:iCs/>
+          <w:color w:val="000000"/>
+        </w:rPr>
+        <w:t xml:space="preserve">Digital Parties: The Challenges of Online Organisation and Participation</w:t>
+      </w:r>
+      <w:r>
+        <w:rPr>
+          <w:rFonts w:ascii="Times New Roman" w:hAnsi="Times New Roman" w:eastAsia="Times New Roman" w:cs="Times New Roman"/>
+          <w:color w:val="000000"/>
+        </w:rPr>
+        <w:t xml:space="preserve">, ed. Oscar Barberà, Giulia Sandri, Patricia Correa and Juan Rodríguez-Teruel, 67–83. Cham: Springer. https://doi.org/10.1007/978-3-030-78668-7_4.</w:t>
+      </w:r>
+    </w:p>
+    <w:p>
+      <w:pPr>
+        <w:spacing w:line="360" w:lineRule="auto"/>
+        <w:ind w:left="317" w:hanging="317"/>
+        <w:keepLines w:val="1"/>
+      </w:pPr>
+      <w:r>
+        <w:rPr>
+          <w:rFonts w:ascii="Times New Roman" w:hAnsi="Times New Roman" w:eastAsia="Times New Roman" w:cs="Times New Roman"/>
+          <w:color w:val="000000"/>
+        </w:rPr>
         <w:t xml:space="preserve">European Commission and High Representative of the Union for Foreign Affairs and Security Policy. 2025. </w:t>
       </w:r>
       <w:r>
@@ -2182,7 +2240,7 @@
           <w:rFonts w:ascii="Times New Roman" w:hAnsi="Times New Roman" w:eastAsia="Times New Roman" w:cs="Times New Roman"/>
           <w:color w:val="000000"/>
         </w:rPr>
-        <w:t xml:space="preserve">European Parliament and Council. 2018. Regulation (EU) 2018/1725 of 23 October 2018 on the protection of natural persons with regard to the processing of personal data by the Union institutions, bodies, offices and agencies and on the free movement of such data, and repealing Regulation (EC) No 45/2001 and Decision No 1247/2002/EC. https://eur-lex.europa.eu/eli/reg/2018/1725/oj/eng.</w:t>
+        <w:t xml:space="preserve">European Parliament and Council. 2018. Regulation (EU) 2018/1725 of 23 October 2018 (data protection by EU institutions and bodies). https://eur-lex.europa.eu/eli/reg/2018/1725/oj/eng.</w:t>
       </w:r>
     </w:p>
     <w:p>
@@ -2238,7 +2296,7 @@
           <w:rFonts w:ascii="Times New Roman" w:hAnsi="Times New Roman" w:eastAsia="Times New Roman" w:cs="Times New Roman"/>
           <w:color w:val="000000"/>
         </w:rPr>
-        <w:t xml:space="preserve">———. 2026. Regulation (EU) 2026/1744 of 8 July 2026 amending Regulations (EU) 2024/1689, (EU) 2018/1139 and (EU) 2023/1230 as regards the simplification of the implementation of harmonised rules on artificial intelligence (Digital Omnibus on AI). OJ L, 2026/1744, 24 July. https://eur-lex.europa.eu/legal-content/EN/TXT/?uri=CELEX%3A32026R1744.</w:t>
+        <w:t xml:space="preserve">———. 2026. Regulation (EU) 2026/1744 of 8 July 2026 (Digital Omnibus on AI). OJ L, 2026/1744, 24 July. https://eur-lex.europa.eu/legal-content/EN/TXT/?uri=CELEX%3A32026R1744.</w:t>
       </w:r>
     </w:p>
     <w:p>
@@ -2395,36 +2453,6 @@
           <w:color w:val="000000"/>
         </w:rPr>
         <w:t xml:space="preserve">. London: Pluto Press.</w:t>
-      </w:r>
-    </w:p>
-    <w:p>
-      <w:pPr>
-        <w:spacing w:line="360" w:lineRule="auto"/>
-        <w:ind w:left="317" w:hanging="317"/>
-        <w:keepLines w:val="1"/>
-      </w:pPr>
-      <w:r>
-        <w:rPr>
-          <w:rFonts w:ascii="Times New Roman" w:hAnsi="Times New Roman" w:eastAsia="Times New Roman" w:cs="Times New Roman"/>
-          <w:color w:val="000000"/>
-        </w:rPr>
-        <w:t xml:space="preserve">Go, Seon Gyu. 2025. “Modelling AI political party: Operating system for better democracy.” In </w:t>
-      </w:r>
-      <w:r>
-        <w:rPr>
-          <w:rFonts w:ascii="Times New Roman" w:hAnsi="Times New Roman" w:eastAsia="Times New Roman" w:cs="Times New Roman"/>
-          <w:i/>
-          <w:iCs/>
-          <w:color w:val="000000"/>
-        </w:rPr>
-        <w:t xml:space="preserve">The Syntheticist Papers, I: Proceedings of the Synthetic Summit 2025</w:t>
-      </w:r>
-      <w:r>
-        <w:rPr>
-          <w:rFonts w:ascii="Times New Roman" w:hAnsi="Times New Roman" w:eastAsia="Times New Roman" w:cs="Times New Roman"/>
-          <w:color w:val="000000"/>
-        </w:rPr>
-        <w:t xml:space="preserve">. https://syntheticism.org/content/8rmodelingGO.html.</w:t>
       </w:r>
     </w:p>
     <w:p>

</xml_diff>

<commit_message>
Synchronize manuscript screenshot with 31 October registry image
</commit_message>
<xml_diff>
--- a/Intelligence_Assessment_First_Term_Synthetic_Party_v01.docx
+++ b/Intelligence_Assessment_First_Term_Synthetic_Party_v01.docx
@@ -151,7 +151,7 @@
       <w:r>
         <w:drawing>
           <wp:inline xmlns:a="http://schemas.openxmlformats.org/drawingml/2006/main" xmlns:pic="http://schemas.openxmlformats.org/drawingml/2006/picture">
-            <wp:extent cx="5623560" cy="3861814"/>
+            <wp:extent cx="5623560" cy="3163252"/>
             <wp:docPr id="1" name="Picture 1" descr="Public source registry terminal, showing dossier navigation and the procedure for contesting records"/>
             <wp:cNvGraphicFramePr>
               <a:graphicFrameLocks noChangeAspect="1"/>
@@ -172,7 +172,7 @@
                   <pic:spPr>
                     <a:xfrm>
                       <a:off x="0" y="0"/>
-                      <a:ext cx="5623560" cy="3861814"/>
+                      <a:ext cx="5623560" cy="3163252"/>
                     </a:xfrm>
                     <a:prstGeom prst="rect"/>
                   </pic:spPr>
@@ -213,7 +213,7 @@
           <w:color w:val="000000"/>
           <w:sz w:val="18"/>
         </w:rPr>
-        <w:t>, Public source registry, v.01. Computer Lars / Asker Bryld Staunæs, 2026. Screenshot of the deployed site, 30 October 2026.</w:t>
+        <w:t>, Public source registry, v.01. Computer Lars / Asker Bryld Staunæs, 2026. Screenshot of the deployed site, 31 October 2026.</w:t>
       </w:r>
     </w:p>
     <w:p>

</xml_diff>